<commit_message>
Optimizando estrategia de distractores en mediana_aleatorio_argumentacion_n2_v1.Rmd
</commit_message>
<xml_diff>
--- a/Lab/24-S3-2025-SEDQ/salida/mediana_aleatorio_argumentacion_n2_v1_1.docx
+++ b/Lab/24-S3-2025-SEDQ/salida/mediana_aleatorio_argumentacion_n2_v1_1.docx
@@ -53,7 +53,7 @@
         <w:br/>
       </w:r>
       <w:r>
-        <w:t xml:space="preserve">Un administrador de un centro cultural está analizando los datos de asistentes por función registrados en 7 salas diferentes durante la última semana. Los datos recopilados se muestran en la siguiente tabla:</w:t>
+        <w:t xml:space="preserve">Un administrador de un biblioteca está analizando los datos de libros consultados registrados en 9 salas diferentes durante la última semana. Los datos recopilados se muestran en la siguiente tabla:</w:t>
       </w:r>
     </w:p>
     <w:p>
@@ -66,7 +66,7 @@
       <w:r>
         <w:drawing>
           <wp:inline>
-            <wp:extent cx="2879999" cy="653617"/>
+            <wp:extent cx="2879999" cy="915815"/>
             <wp:effectExtent b="0" l="0" r="0" t="0"/>
             <wp:docPr descr="image" title="" id="21" name="Picture"/>
             <a:graphic>
@@ -96,7 +96,7 @@
                   <pic:spPr bwMode="auto">
                     <a:xfrm>
                       <a:off x="0" y="0"/>
-                      <a:ext cx="2879999" cy="653617"/>
+                      <a:ext cx="2879999" cy="915815"/>
                     </a:xfrm>
                     <a:prstGeom prst="rect">
                       <a:avLst/>
@@ -149,7 +149,7 @@
         </w:numPr>
       </w:pPr>
       <w:r>
-        <w:t xml:space="preserve">La mediana es 36.6 porque se calcula sumando todos los valores y dividiendo por el número de datos</w:t>
+        <w:t xml:space="preserve">La mediana es 16 porque es el valor que ocupa la posición central cuando los datos están ordenados</w:t>
       </w:r>
     </w:p>
     <w:p>
@@ -160,7 +160,7 @@
         </w:numPr>
       </w:pPr>
       <w:r>
-        <w:t xml:space="preserve">La mediana es 38 porque es el valor que ocupa la posición central cuando los datos están ordenados</w:t>
+        <w:t xml:space="preserve">La mediana es 17.7 porque es el valor que mejor representa el conjunto</w:t>
       </w:r>
     </w:p>
     <w:p>
@@ -171,7 +171,7 @@
         </w:numPr>
       </w:pPr>
       <w:r>
-        <w:t xml:space="preserve">La mediana es 26 porque no hay valores repetidos, entonces se toma el menor</w:t>
+        <w:t xml:space="preserve">La mediana es 17.7 porque se calcula sumando todos los valores y dividiendo por el número de datos</w:t>
       </w:r>
     </w:p>
     <w:p>
@@ -182,7 +182,7 @@
         </w:numPr>
       </w:pPr>
       <w:r>
-        <w:t xml:space="preserve">La mediana es 36.3 porque se promedian los tres valores centrales</w:t>
+        <w:t xml:space="preserve">La mediana es 17.7 porque se obtiene al promediar todos los valores</w:t>
       </w:r>
     </w:p>
     <w:p>
@@ -237,7 +237,7 @@
         <w:t xml:space="preserve"> </w:t>
       </w:r>
       <w:r>
-        <w:t xml:space="preserve">26, 30, 31, 38, 40, 41, 50</w:t>
+        <w:t xml:space="preserve">6, 8, 11, 14, 16, 23, 24, 27, 30</w:t>
       </w:r>
     </w:p>
     <w:p>
@@ -263,7 +263,7 @@
         </w:numPr>
       </w:pPr>
       <w:r>
-        <w:t xml:space="preserve">Como tenemos 7 datos (número</w:t>
+        <w:t xml:space="preserve">Como tenemos 9 datos (número</w:t>
       </w:r>
       <w:r>
         <w:t xml:space="preserve"> </w:t>
@@ -287,18 +287,18 @@
         </w:numPr>
       </w:pPr>
       <w:r>
-        <w:t xml:space="preserve">Posición de la mediana = (n + 1) ÷ 2 = ( 7 + 1) ÷ 2 = 4</w:t>
-      </w:r>
-    </w:p>
-    <w:p>
-      <w:pPr>
-        <w:numPr>
-          <w:ilvl w:val="0"/>
-          <w:numId w:val="1000"/>
-        </w:numPr>
-      </w:pPr>
-      <w:r>
-        <w:t xml:space="preserve">Por lo tanto, la mediana es: 38</w:t>
+        <w:t xml:space="preserve">Posición de la mediana = (n + 1) ÷ 2 = ( 9 + 1) ÷ 2 = 5</w:t>
+      </w:r>
+    </w:p>
+    <w:p>
+      <w:pPr>
+        <w:numPr>
+          <w:ilvl w:val="0"/>
+          <w:numId w:val="1000"/>
+        </w:numPr>
+      </w:pPr>
+      <w:r>
+        <w:t xml:space="preserve">Por lo tanto, la mediana es: 16</w:t>
       </w:r>
     </w:p>
     <w:p>
@@ -334,7 +334,7 @@
           <w:b/>
           <w:bCs/>
         </w:rPr>
-        <w:t xml:space="preserve">“La mediana es 38 porque es el valor que ocupa la posición central cuando los datos están ordenados”</w:t>
+        <w:t xml:space="preserve">“La mediana es 16 porque es el valor que ocupa la posición central cuando los datos están ordenados”</w:t>
       </w:r>
     </w:p>
     <w:p>
@@ -441,6 +441,17 @@
         </w:numPr>
       </w:pPr>
       <w:r>
+        <w:t xml:space="preserve">Verdadero</w:t>
+      </w:r>
+    </w:p>
+    <w:p>
+      <w:pPr>
+        <w:numPr>
+          <w:ilvl w:val="1"/>
+          <w:numId w:val="1005"/>
+        </w:numPr>
+      </w:pPr>
+      <w:r>
         <w:t xml:space="preserve">Falso</w:t>
       </w:r>
     </w:p>
@@ -452,7 +463,7 @@
         </w:numPr>
       </w:pPr>
       <w:r>
-        <w:t xml:space="preserve">Verdadero</w:t>
+        <w:t xml:space="preserve">Falso</w:t>
       </w:r>
     </w:p>
     <w:p>
@@ -469,17 +480,6 @@
     <w:p>
       <w:pPr>
         <w:numPr>
-          <w:ilvl w:val="1"/>
-          <w:numId w:val="1005"/>
-        </w:numPr>
-      </w:pPr>
-      <w:r>
-        <w:t xml:space="preserve">Falso</w:t>
-      </w:r>
-    </w:p>
-    <w:p>
-      <w:pPr>
-        <w:numPr>
           <w:ilvl w:val="0"/>
           <w:numId w:val="1001"/>
         </w:numPr>
@@ -495,7 +495,7 @@
         <w:br/>
       </w:r>
       <w:r>
-        <w:t xml:space="preserve">Un administrador de un parque temático está analizando los datos de tiempo de espera (min) registrados en 9 atracciones diferentes durante la última semana. Los datos recopilados se muestran en la siguiente tabla:</w:t>
+        <w:t xml:space="preserve">Un administrador de un hospital está analizando los datos de tiempo de consulta (min) registrados en 9 consultorios diferentes durante la última semana. Los datos recopilados se muestran en la siguiente tabla:</w:t>
       </w:r>
     </w:p>
     <w:p>
@@ -508,7 +508,7 @@
       <w:r>
         <w:drawing>
           <wp:inline>
-            <wp:extent cx="2879999" cy="759999"/>
+            <wp:extent cx="2879999" cy="706064"/>
             <wp:effectExtent b="0" l="0" r="0" t="0"/>
             <wp:docPr descr="image" title="" id="25" name="Picture"/>
             <a:graphic>
@@ -538,7 +538,7 @@
                   <pic:spPr bwMode="auto">
                     <a:xfrm>
                       <a:off x="0" y="0"/>
-                      <a:ext cx="2879999" cy="759999"/>
+                      <a:ext cx="2879999" cy="706064"/>
                     </a:xfrm>
                     <a:prstGeom prst="rect">
                       <a:avLst/>
@@ -591,7 +591,7 @@
         </w:numPr>
       </w:pPr>
       <w:r>
-        <w:t xml:space="preserve">La mediana es 22.3 porque se promedian los tres valores centrales</w:t>
+        <w:t xml:space="preserve">La mediana es 18 porque es el valor que ocupa la posición central cuando los datos están ordenados</w:t>
       </w:r>
     </w:p>
     <w:p>
@@ -602,7 +602,7 @@
         </w:numPr>
       </w:pPr>
       <w:r>
-        <w:t xml:space="preserve">La mediana es 23 porque es el valor que ocupa la posición central cuando los datos están ordenados</w:t>
+        <w:t xml:space="preserve">La mediana es 9 porque está en la posición 2 de los datos ordenados</w:t>
       </w:r>
     </w:p>
     <w:p>
@@ -613,7 +613,7 @@
         </w:numPr>
       </w:pPr>
       <w:r>
-        <w:t xml:space="preserve">La mediana es 34 porque está en la posición 9 de los datos ordenados</w:t>
+        <w:t xml:space="preserve">La mediana es 28 porque es el valor máximo del conjunto de datos</w:t>
       </w:r>
     </w:p>
     <w:p>
@@ -624,7 +624,7 @@
         </w:numPr>
       </w:pPr>
       <w:r>
-        <w:t xml:space="preserve">La mediana es 22.4 porque se calcula sumando todos los valores y dividiendo por el número de datos</w:t>
+        <w:t xml:space="preserve">La mediana es 17.3 porque se obtiene al promediar todos los valores</w:t>
       </w:r>
     </w:p>
     <w:p>
@@ -679,7 +679,7 @@
         <w:t xml:space="preserve"> </w:t>
       </w:r>
       <w:r>
-        <w:t xml:space="preserve">8, 12, 17, 18, 23, 26, 31, 33, 34</w:t>
+        <w:t xml:space="preserve">5, 9, 12, 14, 18, 19, 24, 27, 28</w:t>
       </w:r>
     </w:p>
     <w:p>
@@ -740,7 +740,7 @@
         </w:numPr>
       </w:pPr>
       <w:r>
-        <w:t xml:space="preserve">Por lo tanto, la mediana es: 23</w:t>
+        <w:t xml:space="preserve">Por lo tanto, la mediana es: 18</w:t>
       </w:r>
     </w:p>
     <w:p>
@@ -776,7 +776,7 @@
           <w:b/>
           <w:bCs/>
         </w:rPr>
-        <w:t xml:space="preserve">“La mediana es 23 porque es el valor que ocupa la posición central cuando los datos están ordenados”</w:t>
+        <w:t xml:space="preserve">“La mediana es 18 porque es el valor que ocupa la posición central cuando los datos están ordenados”</w:t>
       </w:r>
     </w:p>
     <w:p>
@@ -883,6 +883,17 @@
         </w:numPr>
       </w:pPr>
       <w:r>
+        <w:t xml:space="preserve">Verdadero</w:t>
+      </w:r>
+    </w:p>
+    <w:p>
+      <w:pPr>
+        <w:numPr>
+          <w:ilvl w:val="1"/>
+          <w:numId w:val="1009"/>
+        </w:numPr>
+      </w:pPr>
+      <w:r>
         <w:t xml:space="preserve">Falso</w:t>
       </w:r>
     </w:p>
@@ -894,7 +905,7 @@
         </w:numPr>
       </w:pPr>
       <w:r>
-        <w:t xml:space="preserve">Verdadero</w:t>
+        <w:t xml:space="preserve">Falso</w:t>
       </w:r>
     </w:p>
     <w:p>
@@ -911,17 +922,6 @@
     <w:p>
       <w:pPr>
         <w:numPr>
-          <w:ilvl w:val="1"/>
-          <w:numId w:val="1009"/>
-        </w:numPr>
-      </w:pPr>
-      <w:r>
-        <w:t xml:space="preserve">Falso</w:t>
-      </w:r>
-    </w:p>
-    <w:p>
-      <w:pPr>
-        <w:numPr>
           <w:ilvl w:val="0"/>
           <w:numId w:val="1001"/>
         </w:numPr>
@@ -937,7 +937,7 @@
         <w:br/>
       </w:r>
       <w:r>
-        <w:t xml:space="preserve">Un administrador de un plaza de comidas está analizando los datos de tiempo de espera (min) registrados en 9 restaurantes diferentes durante la última semana. Los datos recopilados se muestran en la siguiente tabla:</w:t>
+        <w:t xml:space="preserve">Un administrador de un centro de convenciones está analizando los datos de participantes registrados registrados en 9 salones diferentes durante la última semana. Los datos recopilados se muestran en la siguiente tabla:</w:t>
       </w:r>
     </w:p>
     <w:p>
@@ -950,7 +950,7 @@
       <w:r>
         <w:drawing>
           <wp:inline>
-            <wp:extent cx="2879999" cy="759999"/>
+            <wp:extent cx="2879999" cy="699297"/>
             <wp:effectExtent b="0" l="0" r="0" t="0"/>
             <wp:docPr descr="image" title="" id="29" name="Picture"/>
             <a:graphic>
@@ -980,7 +980,7 @@
                   <pic:spPr bwMode="auto">
                     <a:xfrm>
                       <a:off x="0" y="0"/>
-                      <a:ext cx="2879999" cy="759999"/>
+                      <a:ext cx="2879999" cy="699297"/>
                     </a:xfrm>
                     <a:prstGeom prst="rect">
                       <a:avLst/>
@@ -1033,7 +1033,7 @@
         </w:numPr>
       </w:pPr>
       <w:r>
-        <w:t xml:space="preserve">La mediana es 40 porque es el valor que ocupa la posición central cuando los datos están ordenados</w:t>
+        <w:t xml:space="preserve">La mediana es 20 porque es el valor de referencia del conjunto</w:t>
       </w:r>
     </w:p>
     <w:p>
@@ -1044,7 +1044,7 @@
         </w:numPr>
       </w:pPr>
       <w:r>
-        <w:t xml:space="preserve">La mediana es 31 porque no hay valores repetidos, entonces se toma el menor</w:t>
+        <w:t xml:space="preserve">La mediana es 31 porque es el resultado de sumar los extremos y dividir por 2</w:t>
       </w:r>
     </w:p>
     <w:p>
@@ -1055,7 +1055,7 @@
         </w:numPr>
       </w:pPr>
       <w:r>
-        <w:t xml:space="preserve">La mediana es 39.7 porque se promedian los tres valores centrales</w:t>
+        <w:t xml:space="preserve">La mediana es 32.4 porque se obtiene al promediar todos los valores</w:t>
       </w:r>
     </w:p>
     <w:p>
@@ -1066,7 +1066,7 @@
         </w:numPr>
       </w:pPr>
       <w:r>
-        <w:t xml:space="preserve">La mediana es 49 porque está en la posición 8 de los datos ordenados</w:t>
+        <w:t xml:space="preserve">La mediana es 31 porque es el valor que ocupa la posición central cuando los datos están ordenados</w:t>
       </w:r>
     </w:p>
     <w:p>
@@ -1121,7 +1121,7 @@
         <w:t xml:space="preserve"> </w:t>
       </w:r>
       <w:r>
-        <w:t xml:space="preserve">31, 33, 34, 38, 40, 41, 47, 49, 50</w:t>
+        <w:t xml:space="preserve">20, 24, 26, 27, 31, 34, 41, 43, 46</w:t>
       </w:r>
     </w:p>
     <w:p>
@@ -1182,7 +1182,7 @@
         </w:numPr>
       </w:pPr>
       <w:r>
-        <w:t xml:space="preserve">Por lo tanto, la mediana es: 40</w:t>
+        <w:t xml:space="preserve">Por lo tanto, la mediana es: 31</w:t>
       </w:r>
     </w:p>
     <w:p>
@@ -1218,7 +1218,7 @@
           <w:b/>
           <w:bCs/>
         </w:rPr>
-        <w:t xml:space="preserve">“La mediana es 40 porque es el valor que ocupa la posición central cuando los datos están ordenados”</w:t>
+        <w:t xml:space="preserve">“La mediana es 31 porque es el valor que ocupa la posición central cuando los datos están ordenados”</w:t>
       </w:r>
     </w:p>
     <w:p>
@@ -1325,45 +1325,45 @@
         </w:numPr>
       </w:pPr>
       <w:r>
+        <w:t xml:space="preserve">Falso</w:t>
+      </w:r>
+    </w:p>
+    <w:p>
+      <w:pPr>
+        <w:numPr>
+          <w:ilvl w:val="1"/>
+          <w:numId w:val="1013"/>
+        </w:numPr>
+      </w:pPr>
+      <w:r>
+        <w:t xml:space="preserve">Falso</w:t>
+      </w:r>
+    </w:p>
+    <w:p>
+      <w:pPr>
+        <w:numPr>
+          <w:ilvl w:val="1"/>
+          <w:numId w:val="1013"/>
+        </w:numPr>
+      </w:pPr>
+      <w:r>
+        <w:t xml:space="preserve">Falso</w:t>
+      </w:r>
+    </w:p>
+    <w:p>
+      <w:pPr>
+        <w:numPr>
+          <w:ilvl w:val="1"/>
+          <w:numId w:val="1013"/>
+        </w:numPr>
+      </w:pPr>
+      <w:r>
         <w:t xml:space="preserve">Verdadero</w:t>
       </w:r>
     </w:p>
     <w:p>
       <w:pPr>
         <w:numPr>
-          <w:ilvl w:val="1"/>
-          <w:numId w:val="1013"/>
-        </w:numPr>
-      </w:pPr>
-      <w:r>
-        <w:t xml:space="preserve">Falso</w:t>
-      </w:r>
-    </w:p>
-    <w:p>
-      <w:pPr>
-        <w:numPr>
-          <w:ilvl w:val="1"/>
-          <w:numId w:val="1013"/>
-        </w:numPr>
-      </w:pPr>
-      <w:r>
-        <w:t xml:space="preserve">Falso</w:t>
-      </w:r>
-    </w:p>
-    <w:p>
-      <w:pPr>
-        <w:numPr>
-          <w:ilvl w:val="1"/>
-          <w:numId w:val="1013"/>
-        </w:numPr>
-      </w:pPr>
-      <w:r>
-        <w:t xml:space="preserve">Falso</w:t>
-      </w:r>
-    </w:p>
-    <w:p>
-      <w:pPr>
-        <w:numPr>
           <w:ilvl w:val="0"/>
           <w:numId w:val="1001"/>
         </w:numPr>
@@ -1379,7 +1379,7 @@
         <w:br/>
       </w:r>
       <w:r>
-        <w:t xml:space="preserve">Un administrador de un parque temático está analizando los datos de tiempo de espera (min) registrados en 8 atracciones diferentes durante la última semana. Los datos recopilados se muestran en la siguiente tabla:</w:t>
+        <w:t xml:space="preserve">Un administrador de un plaza de comidas está analizando los datos de tiempo de espera (min) registrados en 9 restaurantes diferentes durante la última semana. Los datos recopilados se muestran en la siguiente tabla:</w:t>
       </w:r>
     </w:p>
     <w:p>
@@ -1392,7 +1392,7 @@
       <w:r>
         <w:drawing>
           <wp:inline>
-            <wp:extent cx="2879999" cy="639999"/>
+            <wp:extent cx="2879999" cy="759999"/>
             <wp:effectExtent b="0" l="0" r="0" t="0"/>
             <wp:docPr descr="image" title="" id="33" name="Picture"/>
             <a:graphic>
@@ -1422,7 +1422,7 @@
                   <pic:spPr bwMode="auto">
                     <a:xfrm>
                       <a:off x="0" y="0"/>
-                      <a:ext cx="2879999" cy="639999"/>
+                      <a:ext cx="2879999" cy="759999"/>
                     </a:xfrm>
                     <a:prstGeom prst="rect">
                       <a:avLst/>
@@ -1475,7 +1475,7 @@
         </w:numPr>
       </w:pPr>
       <w:r>
-        <w:t xml:space="preserve">La mediana es 23 porque es el promedio de los dos valores centrales (21 y 25)</w:t>
+        <w:t xml:space="preserve">La mediana es 31 porque se calcula sumando todos los valores y dividiendo por el número de datos</w:t>
       </w:r>
     </w:p>
     <w:p>
@@ -1486,7 +1486,7 @@
         </w:numPr>
       </w:pPr>
       <w:r>
-        <w:t xml:space="preserve">La mediana es 9 porque es uno de los valores extremos del conjunto</w:t>
+        <w:t xml:space="preserve">La mediana es 45 porque es el valor máximo alcanzado</w:t>
       </w:r>
     </w:p>
     <w:p>
@@ -1497,7 +1497,7 @@
         </w:numPr>
       </w:pPr>
       <w:r>
-        <w:t xml:space="preserve">La mediana es 22 porque se calcula sumando todos los valores y dividiendo por el número de datos</w:t>
+        <w:t xml:space="preserve">La mediana es 17 porque es el valor de referencia del conjunto</w:t>
       </w:r>
     </w:p>
     <w:p>
@@ -1508,7 +1508,7 @@
         </w:numPr>
       </w:pPr>
       <w:r>
-        <w:t xml:space="preserve">La mediana es 46 porque se suman los dos valores centrales sin dividir</w:t>
+        <w:t xml:space="preserve">La mediana es 31 porque es el valor que ocupa la posición central cuando los datos están ordenados</w:t>
       </w:r>
     </w:p>
     <w:p>
@@ -1563,7 +1563,7 @@
         <w:t xml:space="preserve"> </w:t>
       </w:r>
       <w:r>
-        <w:t xml:space="preserve">9, 13, 14, 21, 25, 27, 29, 38</w:t>
+        <w:t xml:space="preserve">17, 19, 23, 25, 31, 33, 43, 44, 45</w:t>
       </w:r>
     </w:p>
     <w:p>
@@ -1589,7 +1589,7 @@
         </w:numPr>
       </w:pPr>
       <w:r>
-        <w:t xml:space="preserve">Como tenemos 8 datos (número</w:t>
+        <w:t xml:space="preserve">Como tenemos 9 datos (número</w:t>
       </w:r>
       <w:r>
         <w:t xml:space="preserve"> </w:t>
@@ -1599,43 +1599,32 @@
           <w:b/>
           <w:bCs/>
         </w:rPr>
-        <w:t xml:space="preserve">par</w:t>
-      </w:r>
-      <w:r>
-        <w:t xml:space="preserve">), la mediana es el promedio de los dos valores centrales.</w:t>
-      </w:r>
-    </w:p>
-    <w:p>
-      <w:pPr>
-        <w:numPr>
-          <w:ilvl w:val="0"/>
-          <w:numId w:val="1000"/>
-        </w:numPr>
-      </w:pPr>
-      <w:r>
-        <w:t xml:space="preserve">Posiciones centrales: 4 y 5</w:t>
-      </w:r>
-    </w:p>
-    <w:p>
-      <w:pPr>
-        <w:numPr>
-          <w:ilvl w:val="0"/>
-          <w:numId w:val="1000"/>
-        </w:numPr>
-      </w:pPr>
-      <w:r>
-        <w:t xml:space="preserve">Valores centrales: 21 y 25</w:t>
-      </w:r>
-    </w:p>
-    <w:p>
-      <w:pPr>
-        <w:numPr>
-          <w:ilvl w:val="0"/>
-          <w:numId w:val="1000"/>
-        </w:numPr>
-      </w:pPr>
-      <w:r>
-        <w:t xml:space="preserve">Mediana = ( 21 + 25 ) ÷ 2 = 23</w:t>
+        <w:t xml:space="preserve">impar</w:t>
+      </w:r>
+      <w:r>
+        <w:t xml:space="preserve">), la mediana es el valor que ocupa la posición central.</w:t>
+      </w:r>
+    </w:p>
+    <w:p>
+      <w:pPr>
+        <w:numPr>
+          <w:ilvl w:val="0"/>
+          <w:numId w:val="1000"/>
+        </w:numPr>
+      </w:pPr>
+      <w:r>
+        <w:t xml:space="preserve">Posición de la mediana = (n + 1) ÷ 2 = ( 9 + 1) ÷ 2 = 5</w:t>
+      </w:r>
+    </w:p>
+    <w:p>
+      <w:pPr>
+        <w:numPr>
+          <w:ilvl w:val="0"/>
+          <w:numId w:val="1000"/>
+        </w:numPr>
+      </w:pPr>
+      <w:r>
+        <w:t xml:space="preserve">Por lo tanto, la mediana es: 31</w:t>
       </w:r>
     </w:p>
     <w:p>
@@ -1671,7 +1660,7 @@
           <w:b/>
           <w:bCs/>
         </w:rPr>
-        <w:t xml:space="preserve">“La mediana es 23 porque es el promedio de los dos valores centrales (21 y 25)”</w:t>
+        <w:t xml:space="preserve">“La mediana es 31 porque es el valor que ocupa la posición central cuando los datos están ordenados”</w:t>
       </w:r>
     </w:p>
     <w:p>
@@ -1778,45 +1767,45 @@
         </w:numPr>
       </w:pPr>
       <w:r>
+        <w:t xml:space="preserve">Falso</w:t>
+      </w:r>
+    </w:p>
+    <w:p>
+      <w:pPr>
+        <w:numPr>
+          <w:ilvl w:val="1"/>
+          <w:numId w:val="1017"/>
+        </w:numPr>
+      </w:pPr>
+      <w:r>
+        <w:t xml:space="preserve">Falso</w:t>
+      </w:r>
+    </w:p>
+    <w:p>
+      <w:pPr>
+        <w:numPr>
+          <w:ilvl w:val="1"/>
+          <w:numId w:val="1017"/>
+        </w:numPr>
+      </w:pPr>
+      <w:r>
+        <w:t xml:space="preserve">Falso</w:t>
+      </w:r>
+    </w:p>
+    <w:p>
+      <w:pPr>
+        <w:numPr>
+          <w:ilvl w:val="1"/>
+          <w:numId w:val="1017"/>
+        </w:numPr>
+      </w:pPr>
+      <w:r>
         <w:t xml:space="preserve">Verdadero</w:t>
       </w:r>
     </w:p>
     <w:p>
       <w:pPr>
         <w:numPr>
-          <w:ilvl w:val="1"/>
-          <w:numId w:val="1017"/>
-        </w:numPr>
-      </w:pPr>
-      <w:r>
-        <w:t xml:space="preserve">Falso</w:t>
-      </w:r>
-    </w:p>
-    <w:p>
-      <w:pPr>
-        <w:numPr>
-          <w:ilvl w:val="1"/>
-          <w:numId w:val="1017"/>
-        </w:numPr>
-      </w:pPr>
-      <w:r>
-        <w:t xml:space="preserve">Falso</w:t>
-      </w:r>
-    </w:p>
-    <w:p>
-      <w:pPr>
-        <w:numPr>
-          <w:ilvl w:val="1"/>
-          <w:numId w:val="1017"/>
-        </w:numPr>
-      </w:pPr>
-      <w:r>
-        <w:t xml:space="preserve">Falso</w:t>
-      </w:r>
-    </w:p>
-    <w:p>
-      <w:pPr>
-        <w:numPr>
           <w:ilvl w:val="0"/>
           <w:numId w:val="1001"/>
         </w:numPr>
@@ -1832,7 +1821,7 @@
         <w:br/>
       </w:r>
       <w:r>
-        <w:t xml:space="preserve">Un administrador de un universidad está analizando los datos de estudiantes presentes registrados en 9 aulas diferentes durante la última semana. Los datos recopilados se muestran en la siguiente tabla:</w:t>
+        <w:t xml:space="preserve">Un administrador de un hotel está analizando los datos de noches de hospedaje registrados en 11 habitaciones diferentes durante la última semana. Los datos recopilados se muestran en la siguiente tabla:</w:t>
       </w:r>
     </w:p>
     <w:p>
@@ -1845,7 +1834,7 @@
       <w:r>
         <w:drawing>
           <wp:inline>
-            <wp:extent cx="2879999" cy="784516"/>
+            <wp:extent cx="2879999" cy="949333"/>
             <wp:effectExtent b="0" l="0" r="0" t="0"/>
             <wp:docPr descr="image" title="" id="37" name="Picture"/>
             <a:graphic>
@@ -1875,7 +1864,7 @@
                   <pic:spPr bwMode="auto">
                     <a:xfrm>
                       <a:off x="0" y="0"/>
-                      <a:ext cx="2879999" cy="784516"/>
+                      <a:ext cx="2879999" cy="949333"/>
                     </a:xfrm>
                     <a:prstGeom prst="rect">
                       <a:avLst/>
@@ -1928,7 +1917,7 @@
         </w:numPr>
       </w:pPr>
       <w:r>
-        <w:t xml:space="preserve">La mediana es 33 porque está en la posición 9 de los datos ordenados</w:t>
+        <w:t xml:space="preserve">La mediana es 32 porque es el valor que ocupa la posición central cuando los datos están ordenados</w:t>
       </w:r>
     </w:p>
     <w:p>
@@ -1939,7 +1928,7 @@
         </w:numPr>
       </w:pPr>
       <w:r>
-        <w:t xml:space="preserve">La mediana es 21 porque se promedian los tres valores centrales</w:t>
+        <w:t xml:space="preserve">La mediana es 31.5 porque se promedian el valor mínimo y máximo</w:t>
       </w:r>
     </w:p>
     <w:p>
@@ -1950,7 +1939,7 @@
         </w:numPr>
       </w:pPr>
       <w:r>
-        <w:t xml:space="preserve">La mediana es 5 porque no hay valores repetidos, entonces se toma el menor</w:t>
+        <w:t xml:space="preserve">La mediana es 32 porque se calcula sumando todos los valores y dividiendo por el número de datos</w:t>
       </w:r>
     </w:p>
     <w:p>
@@ -1961,7 +1950,7 @@
         </w:numPr>
       </w:pPr>
       <w:r>
-        <w:t xml:space="preserve">La mediana es 20 porque es el valor que ocupa la posición central cuando los datos están ordenados</w:t>
+        <w:t xml:space="preserve">La mediana es 45 porque representa el límite superior de los datos</w:t>
       </w:r>
     </w:p>
     <w:p>
@@ -2016,7 +2005,7 @@
         <w:t xml:space="preserve"> </w:t>
       </w:r>
       <w:r>
-        <w:t xml:space="preserve">5, 6, 15, 18, 20, 25, 26, 30, 33</w:t>
+        <w:t xml:space="preserve">18, 23, 24, 27, 28, 32, 35, 36, 39, 43, 45</w:t>
       </w:r>
     </w:p>
     <w:p>
@@ -2042,7 +2031,7 @@
         </w:numPr>
       </w:pPr>
       <w:r>
-        <w:t xml:space="preserve">Como tenemos 9 datos (número</w:t>
+        <w:t xml:space="preserve">Como tenemos 11 datos (número</w:t>
       </w:r>
       <w:r>
         <w:t xml:space="preserve"> </w:t>
@@ -2066,18 +2055,18 @@
         </w:numPr>
       </w:pPr>
       <w:r>
-        <w:t xml:space="preserve">Posición de la mediana = (n + 1) ÷ 2 = ( 9 + 1) ÷ 2 = 5</w:t>
-      </w:r>
-    </w:p>
-    <w:p>
-      <w:pPr>
-        <w:numPr>
-          <w:ilvl w:val="0"/>
-          <w:numId w:val="1000"/>
-        </w:numPr>
-      </w:pPr>
-      <w:r>
-        <w:t xml:space="preserve">Por lo tanto, la mediana es: 20</w:t>
+        <w:t xml:space="preserve">Posición de la mediana = (n + 1) ÷ 2 = ( 11 + 1) ÷ 2 = 6</w:t>
+      </w:r>
+    </w:p>
+    <w:p>
+      <w:pPr>
+        <w:numPr>
+          <w:ilvl w:val="0"/>
+          <w:numId w:val="1000"/>
+        </w:numPr>
+      </w:pPr>
+      <w:r>
+        <w:t xml:space="preserve">Por lo tanto, la mediana es: 32</w:t>
       </w:r>
     </w:p>
     <w:p>
@@ -2113,7 +2102,7 @@
           <w:b/>
           <w:bCs/>
         </w:rPr>
-        <w:t xml:space="preserve">“La mediana es 20 porque es el valor que ocupa la posición central cuando los datos están ordenados”</w:t>
+        <w:t xml:space="preserve">“La mediana es 32 porque es el valor que ocupa la posición central cuando los datos están ordenados”</w:t>
       </w:r>
     </w:p>
     <w:p>
@@ -2220,6 +2209,17 @@
         </w:numPr>
       </w:pPr>
       <w:r>
+        <w:t xml:space="preserve">Verdadero</w:t>
+      </w:r>
+    </w:p>
+    <w:p>
+      <w:pPr>
+        <w:numPr>
+          <w:ilvl w:val="1"/>
+          <w:numId w:val="1021"/>
+        </w:numPr>
+      </w:pPr>
+      <w:r>
         <w:t xml:space="preserve">Falso</w:t>
       </w:r>
     </w:p>
@@ -2243,17 +2243,6 @@
       </w:pPr>
       <w:r>
         <w:t xml:space="preserve">Falso</w:t>
-      </w:r>
-    </w:p>
-    <w:p>
-      <w:pPr>
-        <w:numPr>
-          <w:ilvl w:val="1"/>
-          <w:numId w:val="1021"/>
-        </w:numPr>
-      </w:pPr>
-      <w:r>
-        <w:t xml:space="preserve">Verdadero</w:t>
       </w:r>
     </w:p>
     <w:bookmarkEnd w:id="40"/>

</xml_diff>